<commit_message>
docs(patent): fix claim clarity defects, add inventive-step argumentation
清楚性批（不改保护范围）：
- 「经可靠装配谱系确认的无关部件」改为「经比较开始前已经存在并通过来源
  校验和版本校验的装配谱系记录确认的无关部件」。「可靠」全文无定义，是
  《指南》二部二章 3.2.2 下的可预期靶点；改后与全文其他校验措辞一致。
  申请正文 3 处 + 交底书生成器 1 处同步。
- 权 28 的「名称未变／名称已变」补 `权利要求16所述` 引用基础（该状态由
  权 16 定义，28→15→1 依赖链上取不到）。
- 权 29 的「仅重命名」补 `权利要求28所述`（权 29 依赖权 1，而权 1 的七项
  分类不含该项）。
- 权 38 的 J_change^l 补 `权利要求15所述`；权 39 经 39→38 继承。
- 说明书补 tau_change^l 值域：位于零至一区间且严格大于零，取零属配置错误。

答辩弹药批（不改权项，仅补论证）：
- 八项闭环段补「拆开即失效」必要性论证，替代原顺序性陈述，针对组合型
  显而易见性：分区检查提前则端点归属未定必然失败且无法给出补读指令；
  删去冻结则完备性要求强制把证据不足端点挤入增删；删去基数保真则互斥
  约束作用于折叠后端点集合且分区检查发现不了遗漏。
- 有益效果第 4 项补增删凭证的工程后果链条，针对 US10816957B2 独权已含
  的「匹配完成后判增删」：真删除与读取失败在残余位置不可区分，下游 ECN／
  工艺／检测要求相反处置，凭证表达的是「有证据表明不存在」而非「尚未
  取得证据」。

验证：47/47 mathtext 用例通过；两生成器语法通过；四份 DOCX 与两份 PDF
重新生成。申请 PDF 仍 42 页、无替换字符；9 项改动逐项命中；权项 58 项
编号连续、独权仍为 1/53/57/58、权 1 恰七步、无前向或自引用、摘要 298 字。
轻量化摘要案两份产物正文经 XML 文本比对确认未变，已还原以避免仅
元数据差异入库。

Co-Authored-By: Claude Opus 5 <noreply@anthropic.com>
</commit_message>
<xml_diff>
--- a/docs/submission/永久命名-CAD模型差异对比-发明专利申请文件.docx
+++ b/docs/submission/永久命名-CAD模型差异对比-发明专利申请文件.docx
@@ -364,7 +364,7 @@
           <w:rFonts w:ascii="Calibri" w:hAnsi="Calibri" w:eastAsia="SimSun"/>
           <w:sz w:val="22"/>
         </w:rPr>
-        <w:t>及关系验证的软身份证据、仅在身份确定后才计算的允许变化属性相互分离，其中所述硬身份约束取自所述永久命名实体索引中的实体维度、不可跨越的实体类型族和经可靠装配谱系确认的无关部件，语义类别、父级特征和拓扑邻接角色不作为硬身份约束而分别归入语义、层级上下文和关系角色三个软证据组，所述允许变化属性取自尺寸、参数和修剪几何；按命名域元数据以及覆盖率、一致性、冲突率和映射指标执行全局三态路由，并对每个比较规范键执行可信、歧义、冲突和低信息的局部门控；</w:t>
+        <w:t>及关系验证的软身份证据、仅在身份确定后才计算的允许变化属性相互分离，其中所述硬身份约束取自所述永久命名实体索引中的实体维度、不可跨越的实体类型族和经比较开始前已经存在并通过来源校验和版本校验的装配谱系记录确认的无关部件，语义类别、父级特征和拓扑邻接角色不作为硬身份约束而分别归入语义、层级上下文和关系角色三个软证据组，所述允许变化属性取自尺寸、参数和修剪几何；按命名域元数据以及覆盖率、一致性、冲突率和映射指标执行全局三态路由，并对每个比较规范键执行可信、歧义、冲突和低信息的局部门控；</w:t>
       </w:r>
     </w:p>
     <w:p>
@@ -4256,7 +4256,7 @@
           <w:rFonts w:ascii="Calibri" w:hAnsi="Calibri" w:eastAsia="SimSun"/>
           <w:sz w:val="22"/>
         </w:rPr>
-        <w:t>中综合变化度不大于同一性阈值且名称未变的实体对分类为保持不变，综合变化度不大于同一性阈值但存在名称变化的实体对分类为仅重命名，综合变化度大于同一性阈值的实体对分类为修改并可携带重命名副标签；所述一对多关系集合</w:t>
+        <w:t>中综合变化度不大于同一性阈值且处于权利要求16所述名称未变状态的实体对分类为保持不变，综合变化度不大于同一性阈值但处于权利要求16所述名称已变状态的实体对分类为仅重命名，综合变化度大于同一性阈值的实体对分类为修改并可携带重命名副标签；所述一对多关系集合</w:t>
       </w:r>
       <w:r>
         <w:rPr>
@@ -4313,7 +4313,7 @@
           <w:rFonts w:ascii="Calibri" w:hAnsi="Calibri" w:eastAsia="SimSun"/>
           <w:sz w:val="22"/>
         </w:rPr>
-        <w:t>29. 根据权利要求1所述的方法，其特征在于，所述类型化差异事件CAD_DIFF_EVENT_V1的每条记录包括事件标识、比较作用域标识、主分类、副标签集合、第一侧端点、第二侧端点、证据引用集合、代次键集合、恢复代次和闭包快照标识，并由事件登记表统一登记；其中保持不变、仅重命名和修改事件的两侧端点均非空，分裂事件的第二侧端点为实体组，合并事件的第一侧端点为实体组，新增事件的第一侧端点为空，删除事件的第二侧端点为空，待复核事件按其成因记录非空的一侧端点或两侧端点；主分类不是保持不变的事件构成差异集合。</w:t>
+        <w:t>29. 根据权利要求1所述的方法，其特征在于，所述类型化差异事件CAD_DIFF_EVENT_V1的每条记录包括事件标识、比较作用域标识、主分类、副标签集合、第一侧端点、第二侧端点、证据引用集合、代次键集合、恢复代次和闭包快照标识，并由事件登记表统一登记；其中保持不变、权利要求28所述仅重命名和修改事件的两侧端点均非空，分裂事件的第二侧端点为实体组，合并事件的第一侧端点为实体组，新增事件的第一侧端点为空，删除事件的第二侧端点为空，待复核事件按其成因记录非空的一侧端点或两侧端点；主分类不是保持不变的事件构成差异集合。</w:t>
       </w:r>
     </w:p>
     <w:p>
@@ -4526,7 +4526,7 @@
           <w:rFonts w:ascii="Calibri" w:hAnsi="Calibri" w:eastAsia="SimSun"/>
           <w:sz w:val="22"/>
         </w:rPr>
-        <w:t>且其身份验证和指纹验证均已通过；该实体对所在的关系闭包已经成立；所述版本指纹对应的模型版本标识、缓存的直接依赖摘要和当前代次键集合均有效；所述版本指纹的内容覆盖该比较层级所需变化证据维度集合</w:t>
+        <w:t>且其身份验证和指纹验证均已通过；该实体对所在的关系闭包已经成立；所述版本指纹对应的模型版本标识、缓存的直接依赖摘要和当前代次键集合均有效；所述版本指纹的内容覆盖权利要求15所述该比较层级所需变化证据维度集合</w:t>
       </w:r>
       <w:r>
         <w:rPr>
@@ -5585,7 +5585,7 @@
           <w:rFonts w:ascii="Calibri" w:hAnsi="Calibri" w:eastAsia="SimSun"/>
           <w:sz w:val="22"/>
         </w:rPr>
-        <w:t>及关系验证的软身份证据、仅在身份确定后才计算的允许变化属性相互分离，其中所述硬身份约束取自所述永久命名实体索引中的实体维度、不可跨越的实体类型族和经可靠装配谱系确认的无关部件，语义类别、父级特征和拓扑邻接角色不作为硬身份约束而分别归入语义、层级上下文和关系角色三个软证据组，所述允许变化属性取自尺寸、参数和修剪几何；按命名域元数据以及覆盖率、一致性、冲突率和映射指标执行全局三态路由，并对每个比较规范键执行可信、歧义、冲突和低信息的局部门控。该步骤同时承载身份与变化分离和质量状态门控。</w:t>
+        <w:t>及关系验证的软身份证据、仅在身份确定后才计算的允许变化属性相互分离，其中所述硬身份约束取自所述永久命名实体索引中的实体维度、不可跨越的实体类型族和经比较开始前已经存在并通过来源校验和版本校验的装配谱系记录确认的无关部件，语义类别、父级特征和拓扑邻接角色不作为硬身份约束而分别归入语义、层级上下文和关系角色三个软证据组，所述允许变化属性取自尺寸、参数和修剪几何；按命名域元数据以及覆盖率、一致性、冲突率和映射指标执行全局三态路由，并对每个比较规范键执行可信、歧义、冲突和低信息的局部门控。该步骤同时承载身份与变化分离和质量状态门控。</w:t>
       </w:r>
     </w:p>
     <w:p>
@@ -5823,7 +5823,7 @@
           <w:rFonts w:ascii="Calibri" w:hAnsi="Calibri" w:eastAsia="SimSun"/>
           <w:sz w:val="22"/>
         </w:rPr>
-        <w:t>上述七个步骤把下述八项技术闭环组合在同一条CAD数据处理链上：从比较开始前已存在的永久命名索引建立实体与比较规范键的关联关系并保留映射基数；把实体身份不变量与允许发生设计变化的几何、参数或修剪属性分开处理；根据双侧映射基数、命名域元数据、身份一致性和数据可用性生成可信、歧义、冲突或低信息状态；同时形成一对一、一对多和多对一候选关系假设并在双侧端点共享互斥约束下选择通过验证的关系；把候选竞争未决、验证数据缺失或局部读取失败的端点置入待复核冻结集合；对最终关系和冻结集合执行双侧分区不变量检查；检查失败时撤销低置信关系、扩大失败局部的CAD数据读取范围或将相关端点转入冻结集合后重新验证；只有关系端点与未决端点闭包成立后才把其余第一侧端点确定为删除、其余第二侧端点确定为新增。上述八项中的每一项均以前一项的输出为输入，不构成彼此独立的并列步骤，也不能被替换为在闭包成立之前直接由名称存在性得出增删结论的处理。</w:t>
+        <w:t>上述七个步骤把下述八项技术闭环组合在同一条CAD数据处理链上：从比较开始前已存在的永久命名索引建立实体与比较规范键的关联关系并保留映射基数；把实体身份不变量与允许发生设计变化的几何、参数或修剪属性分开处理；根据双侧映射基数、命名域元数据、身份一致性和数据可用性生成可信、歧义、冲突或低信息状态；同时形成一对一、一对多和多对一候选关系假设并在双侧端点共享互斥约束下选择通过验证的关系；把候选竞争未决、验证数据缺失或局部读取失败的端点置入待复核冻结集合；对最终关系和冻结集合执行双侧分区不变量检查；检查失败时撤销低置信关系、扩大失败局部的CAD数据读取范围或将相关端点转入冻结集合后重新验证；只有关系端点与未决端点闭包成立后才把其余第一侧端点确定为删除、其余第二侧端点确定为新增。上述八项中的每一项均以前一项的输出为输入，不构成彼此独立的并列步骤，也不能被替换为在闭包成立之前直接由名称存在性得出增删结论的处理。上述八项亦不能任意换序或删减，换序或删减将产生确定的错误输出。若把步骤五的双侧完备不交分区不变量检查置于步骤四的联合选择之前，则该检查所要判定的端点归属在联合选择完成之前尚未确定，检查必然失败，该不变量也无法作为决定后续补读哪些局部B-rep面、边、顶点及其拓扑邻接关系的控制条件，从而退化为不产生任何读取指令的事后断言。若删去步骤四的未决冻结，则双侧完备不交分区不变量的完备性要求会强制把候选竞争未决、身份证据不足和局部B-rep读取失败的端点计入删除集合或新增集合，即证据不足的端点必然被输出为设计变更，而不是仅存在被误判的可能。若删去步骤一的映射基数保真，则同一比较规范键命中的多个实体在进入步骤四之前已被折叠为单个端点，步骤四的双侧端点互斥约束将作用于折叠后的端点集合而不是原始可审计实体集合，被折叠掉的实体既不参与选择也不出现在任何分类中，双侧分区检查因而无法发现该遗漏。</w:t>
       </w:r>
     </w:p>
     <w:p>
@@ -6002,7 +6002,7 @@
           <w:rFonts w:ascii="Calibri" w:hAnsi="Calibri" w:eastAsia="SimSun"/>
           <w:sz w:val="22"/>
         </w:rPr>
-        <w:t>4. 未决冻结。技术特征为步骤四对不能取得预定绝对裕量、身份证据不足、局部B-rep读取失败或预算溢出的端点，在其候选冲突闭包上求取冻结最小不动点并转入冻结集合。作用机理是把证据不充分的端点整体移出确定性分类的输入，并使同一冲突闭包内的端点不被部分处理。技术效果是读取失败或候选竞争未决的端点不会被计入新增或删除，避免把证据不足的端点过早归入增删分类。</w:t>
+        <w:t>4. 未决冻结。技术特征为步骤四对不能取得预定绝对裕量、身份证据不足、局部B-rep读取失败或预算溢出的端点，在其候选冲突闭包上求取冻结最小不动点并转入冻结集合。作用机理是把证据不充分的端点整体移出确定性分类的输入，并使同一冲突闭包内的端点不被部分处理。技术效果是读取失败或候选竞争未决的端点不会被计入新增或删除，避免把证据不足的端点过早归入增删分类。进一步地，确有删除的第一侧端点与仅因局部B-rep读取失败或预算溢出而暂不可判定的第一侧端点，在残余端点这一位置上不可区分，二者均表现为未被任何已确定关系覆盖；若仅以匹配结束后的残余状态判定增删，则两者产生同一输出，而其在下游的工程变更通知生成、制造工艺影响分析、装配约束变化分析和检测标注复核中要求相反的工程处置，即前者应当撤除对应的加工工序与检测尺寸，后者应当保持工艺与检测数据不变并重新读取该局部数据。因此新增与删除不由残余状态支持，而由同代次的端点级失败凭证支持；该凭证要求候选边生成已经完成、全部假设均被明确否决、不存在未决的读取失败记录或预算溢出记录，因而表达的是有证据表明不存在对应实体，而不是尚未取得对应证据，使数据读取故障不被输出为设计变更。</w:t>
       </w:r>
     </w:p>
     <w:p>
@@ -6996,7 +6996,7 @@
           <w:rFonts w:ascii="Calibri" w:hAnsi="Calibri" w:eastAsia="SimSun"/>
           <w:sz w:val="22"/>
         </w:rPr>
-        <w:t>1. 硬身份约束。取自永久命名实体索引中的实体维度、不可跨越的实体类型族和经可靠装配谱系确认的无关部件。硬身份约束只具有否决效力，任一硬身份约束不相容时直接判定对应键对或关系假设不成立，且不由其他维度的得分补偿。层级、一般上下文、模型树位置、邻接关系和关系角色属于软身份证据，不得提升为硬身份否决；单实体变化量及其直接派生值也不得以阈值、组合分或替代特征的形式回流到身份否决。</w:t>
+        <w:t>1. 硬身份约束。取自永久命名实体索引中的实体维度、不可跨越的实体类型族和经比较开始前已经存在并通过来源校验和版本校验的装配谱系记录确认的无关部件。硬身份约束只具有否决效力，任一硬身份约束不相容时直接判定对应键对或关系假设不成立，且不由其他维度的得分补偿。层级、一般上下文、模型树位置、邻接关系和关系角色属于软身份证据，不得提升为硬身份否决；单实体变化量及其直接派生值也不得以阈值、组合分或替代特征的形式回流到身份否决。</w:t>
       </w:r>
     </w:p>
     <w:p>
@@ -11869,7 +11869,127 @@
           <w:rFonts w:ascii="Calibri" w:hAnsi="Calibri" w:eastAsia="SimSun"/>
           <w:sz w:val="22"/>
         </w:rPr>
-        <w:t>。对已进入</w:t>
+        <w:t>；</w:t>
+      </w:r>
+      <w:r>
+        <w:rPr>
+          <w:rFonts w:ascii="Calibri" w:hAnsi="Calibri" w:eastAsia="SimSun"/>
+          <w:sz w:val="22"/>
+        </w:rPr>
+        <w:t>τ</w:t>
+      </w:r>
+      <w:r>
+        <w:rPr>
+          <w:rFonts w:ascii="Calibri" w:hAnsi="Calibri" w:eastAsia="SimSun"/>
+          <w:sz w:val="22"/>
+          <w:vertAlign w:val="subscript"/>
+        </w:rPr>
+        <w:t>change</w:t>
+      </w:r>
+      <w:r>
+        <w:rPr>
+          <w:rFonts w:ascii="Calibri" w:hAnsi="Calibri" w:eastAsia="SimSun"/>
+          <w:sz w:val="22"/>
+          <w:vertAlign w:val="superscript"/>
+        </w:rPr>
+        <w:t>l</w:t>
+      </w:r>
+      <w:r>
+        <w:rPr>
+          <w:rFonts w:ascii="Calibri" w:hAnsi="Calibri" w:eastAsia="SimSun"/>
+          <w:sz w:val="22"/>
+        </w:rPr>
+        <w:t>与</w:t>
+      </w:r>
+      <w:r>
+        <w:rPr>
+          <w:rFonts w:ascii="Calibri" w:hAnsi="Calibri" w:eastAsia="SimSun"/>
+          <w:sz w:val="22"/>
+        </w:rPr>
+        <w:t>τ</w:t>
+      </w:r>
+      <w:r>
+        <w:rPr>
+          <w:rFonts w:ascii="Calibri" w:hAnsi="Calibri" w:eastAsia="SimSun"/>
+          <w:sz w:val="22"/>
+          <w:vertAlign w:val="subscript"/>
+        </w:rPr>
+        <w:t>same</w:t>
+      </w:r>
+      <w:r>
+        <w:rPr>
+          <w:rFonts w:ascii="Calibri" w:hAnsi="Calibri" w:eastAsia="SimSun"/>
+          <w:sz w:val="22"/>
+          <w:vertAlign w:val="superscript"/>
+        </w:rPr>
+        <w:t>l</w:t>
+      </w:r>
+      <w:r>
+        <w:rPr>
+          <w:rFonts w:ascii="Calibri" w:hAnsi="Calibri" w:eastAsia="SimSun"/>
+          <w:sz w:val="22"/>
+        </w:rPr>
+        <w:t>均位于零至一区间，且</w:t>
+      </w:r>
+      <w:r>
+        <w:rPr>
+          <w:rFonts w:ascii="Calibri" w:hAnsi="Calibri" w:eastAsia="SimSun"/>
+          <w:sz w:val="22"/>
+        </w:rPr>
+        <w:t>τ</w:t>
+      </w:r>
+      <w:r>
+        <w:rPr>
+          <w:rFonts w:ascii="Calibri" w:hAnsi="Calibri" w:eastAsia="SimSun"/>
+          <w:sz w:val="22"/>
+          <w:vertAlign w:val="subscript"/>
+        </w:rPr>
+        <w:t>change</w:t>
+      </w:r>
+      <w:r>
+        <w:rPr>
+          <w:rFonts w:ascii="Calibri" w:hAnsi="Calibri" w:eastAsia="SimSun"/>
+          <w:sz w:val="22"/>
+          <w:vertAlign w:val="superscript"/>
+        </w:rPr>
+        <w:t>l</w:t>
+      </w:r>
+      <w:r>
+        <w:rPr>
+          <w:rFonts w:ascii="Calibri" w:hAnsi="Calibri" w:eastAsia="SimSun"/>
+          <w:sz w:val="22"/>
+        </w:rPr>
+        <w:t>严格大于零，取零的</w:t>
+      </w:r>
+      <w:r>
+        <w:rPr>
+          <w:rFonts w:ascii="Calibri" w:hAnsi="Calibri" w:eastAsia="SimSun"/>
+          <w:sz w:val="22"/>
+        </w:rPr>
+        <w:t>τ</w:t>
+      </w:r>
+      <w:r>
+        <w:rPr>
+          <w:rFonts w:ascii="Calibri" w:hAnsi="Calibri" w:eastAsia="SimSun"/>
+          <w:sz w:val="22"/>
+          <w:vertAlign w:val="subscript"/>
+        </w:rPr>
+        <w:t>change</w:t>
+      </w:r>
+      <w:r>
+        <w:rPr>
+          <w:rFonts w:ascii="Calibri" w:hAnsi="Calibri" w:eastAsia="SimSun"/>
+          <w:sz w:val="22"/>
+          <w:vertAlign w:val="superscript"/>
+        </w:rPr>
+        <w:t>l</w:t>
+      </w:r>
+      <w:r>
+        <w:rPr>
+          <w:rFonts w:ascii="Calibri" w:hAnsi="Calibri" w:eastAsia="SimSun"/>
+          <w:sz w:val="22"/>
+        </w:rPr>
+        <w:t>使变化证据覆盖门控恒定通过，属于配置错误，不据此宣称变化门控通过。对已进入</w:t>
       </w:r>
       <w:r>
         <w:rPr>

</xml_diff>